<commit_message>
feat: measure the firewall on public datasets (L1, L2, L3, Spotlighting, L4); report v2
Public data is used only to measure; L1/L2 thresholds and the L2 checkpoint are unchanged.
- data/scripts/prepare_public_eval.py: 13 public sets -> common CSV, overlap check against project data
- evaluation/eval_public.py, eval_public_l3.py, eval_public_l4.py and results (public_eval*.json)
- data/raw/public/SOURCES.md + hashes.json: sources, licences, SHA-256; HackAPrompt and OWASP not downloaded (need a Hugging Face account)
- docs/public_data_implementation_plan.md with execution status; AI use log updated
- BaoCao_Firewall_Layer0_5_v2.docx: report rewritten with the public-data results
- raw public data, per-row results and judge prompts stay out of git (.gitignore)

Co-Authored-By: Claude Sonnet 5.5 <noreply@anthropic.com>
</commit_message>
<xml_diff>
--- a/BaoCao_Firewall_Layer0_5.docx
+++ b/BaoCao_Firewall_Layer0_5.docx
@@ -11288,7 +11288,7 @@
         <w:spacing w:after="60" w:line="290"/>
       </w:pPr>
       <w:r>
-        <w:t xml:space="preserve">Phần tiếng Việt gần như hoàn toàn do AI sinh (llm_gen_vi, hard_cases, một phần tmdeptrai), cộng một phần do Claude viết. Chưa có dữ liệu tiếng Việt thật từ người dùng.</w:t>
+        <w:t xml:space="preserve">Phần tiếng Việt gần như hoàn toàn do AI sinh (llm_gen_vi, hard_cases, một phần tmdeptrai), cộng một phần do Claude viết. Chưa có dữ liệu tiếng Việt thật từ người dùng. Dữ liệu công khai bổ sung ở mục 2.5.7 cũng chỉ thêm được 315 câu MultiJail và 50 đến 100 mẫu nhóm tự viết.</w:t>
       </w:r>
     </w:p>
     <w:p>
@@ -11426,7 +11426,7 @@
         <w:spacing w:after="60" w:line="290"/>
       </w:pPr>
       <w:r>
-        <w:t xml:space="preserve">Ba vai trò: Huấn luyện (model hoặc chỉ mục học từ dữ liệu), Chọn ngưỡng (dữ liệu quyết định một con số cấu hình), Đo (chỉ để báo cáo kết quả). Cột thứ ba ghi ai viết dữ liệu và vai trò theo layer.</w:t>
+        <w:t xml:space="preserve">Ba vai trò: Huấn luyện (model hoặc chỉ mục học từ dữ liệu), Chọn ngưỡng (dữ liệu quyết định một con số cấu hình), Đo (chỉ để báo cáo kết quả). Cột thứ ba ghi ai viết dữ liệu và vai trò theo layer. Các dòng nền xanh là dữ liệu công khai bổ sung theo kế hoạch (docs/public_data_implementation_plan.md): chưa được tải về, kích thước là số thô lấy từ trang của từng dự án (kiểm tra ngày 14/10/2026), số dòng dự kiến là đề xuất, chưa đo. Hướng đề xuất (chưa chốt) là giữ nguyên L2 và chỉ dùng phần bổ sung để đo, không đưa vào train hay chọn ngưỡng. Tensor Trust, HackAPrompt và MultiJail chỉ có nhãn tấn công, nên chặn nhầm chỉ đo được trên khoảng 1.000 đến 1.300 câu bình thường.</w:t>
       </w:r>
     </w:p>
     <w:tbl>
@@ -13064,6 +13064,790 @@
           </w:p>
         </w:tc>
       </w:tr>
+      <w:tr>
+        <w:tc>
+          <w:tcPr>
+            <w:tcW w:type="dxa" w:w="2600"/>
+            <w:shd w:fill="E2EFDA" w:color="auto" w:val="clear"/>
+            <w:tcMar>
+              <w:top w:type="dxa" w:w="50"/>
+              <w:left w:type="dxa" w:w="90"/>
+              <w:bottom w:type="dxa" w:w="50"/>
+              <w:right w:type="dxa" w:w="90"/>
+            </w:tcMar>
+          </w:tcPr>
+          <w:p>
+            <w:pPr>
+              <w:spacing w:after="0" w:line="260"/>
+            </w:pPr>
+            <w:r>
+              <w:rPr>
+                <w:sz w:val="18"/>
+                <w:szCs w:val="18"/>
+              </w:rPr>
+              <w:t xml:space="preserve">Tensor Trust (bổ sung)</w:t>
+            </w:r>
+          </w:p>
+        </w:tc>
+        <w:tc>
+          <w:tcPr>
+            <w:tcW w:type="dxa" w:w="2300"/>
+            <w:shd w:fill="E2EFDA" w:color="auto" w:val="clear"/>
+            <w:tcMar>
+              <w:top w:type="dxa" w:w="50"/>
+              <w:left w:type="dxa" w:w="90"/>
+              <w:bottom w:type="dxa" w:w="50"/>
+              <w:right w:type="dxa" w:w="90"/>
+            </w:tcMar>
+          </w:tcPr>
+          <w:p>
+            <w:pPr>
+              <w:spacing w:after="0" w:line="260"/>
+            </w:pPr>
+            <w:r>
+              <w:rPr>
+                <w:sz w:val="18"/>
+                <w:szCs w:val="18"/>
+              </w:rPr>
+              <w:t xml:space="preserve">Hơn 126.000 tấn công thô; dự kiến lấy 2.000 đến 3.000 sau lọc trùng</w:t>
+            </w:r>
+          </w:p>
+        </w:tc>
+        <w:tc>
+          <w:tcPr>
+            <w:tcW w:type="dxa" w:w="2400"/>
+            <w:shd w:fill="E2EFDA" w:color="auto" w:val="clear"/>
+            <w:tcMar>
+              <w:top w:type="dxa" w:w="50"/>
+              <w:left w:type="dxa" w:w="90"/>
+              <w:bottom w:type="dxa" w:w="50"/>
+              <w:right w:type="dxa" w:w="90"/>
+            </w:tcMar>
+          </w:tcPr>
+          <w:p>
+            <w:pPr>
+              <w:spacing w:after="0" w:line="260"/>
+            </w:pPr>
+            <w:r>
+              <w:rPr>
+                <w:sz w:val="18"/>
+                <w:szCs w:val="18"/>
+              </w:rPr>
+              <w:t xml:space="preserve">Người viết (người chơi trò chơi online); công khai, giấy phép chưa xác minh</w:t>
+            </w:r>
+          </w:p>
+        </w:tc>
+        <w:tc>
+          <w:tcPr>
+            <w:tcW w:type="dxa" w:w="1726"/>
+            <w:shd w:fill="E2EFDA" w:color="auto" w:val="clear"/>
+            <w:tcMar>
+              <w:top w:type="dxa" w:w="50"/>
+              <w:left w:type="dxa" w:w="90"/>
+              <w:bottom w:type="dxa" w:w="50"/>
+              <w:right w:type="dxa" w:w="90"/>
+            </w:tcMar>
+          </w:tcPr>
+          <w:p>
+            <w:pPr>
+              <w:spacing w:after="0" w:line="260"/>
+            </w:pPr>
+            <w:r>
+              <w:rPr>
+                <w:sz w:val="18"/>
+                <w:szCs w:val="18"/>
+              </w:rPr>
+              <w:t xml:space="preserve">L1 và L2. Đo tỷ lệ bắt tấn công (chỉ có nhãn tấn công)</w:t>
+            </w:r>
+          </w:p>
+        </w:tc>
+      </w:tr>
+      <w:tr>
+        <w:tc>
+          <w:tcPr>
+            <w:tcW w:type="dxa" w:w="2600"/>
+            <w:shd w:fill="E2EFDA" w:color="auto" w:val="clear"/>
+            <w:tcMar>
+              <w:top w:type="dxa" w:w="50"/>
+              <w:left w:type="dxa" w:w="90"/>
+              <w:bottom w:type="dxa" w:w="50"/>
+              <w:right w:type="dxa" w:w="90"/>
+            </w:tcMar>
+          </w:tcPr>
+          <w:p>
+            <w:pPr>
+              <w:spacing w:after="0" w:line="260"/>
+            </w:pPr>
+            <w:r>
+              <w:rPr>
+                <w:sz w:val="18"/>
+                <w:szCs w:val="18"/>
+              </w:rPr>
+              <w:t xml:space="preserve">HackAPrompt (bổ sung)</w:t>
+            </w:r>
+          </w:p>
+        </w:tc>
+        <w:tc>
+          <w:tcPr>
+            <w:tcW w:type="dxa" w:w="2300"/>
+            <w:shd w:fill="E2EFDA" w:color="auto" w:val="clear"/>
+            <w:tcMar>
+              <w:top w:type="dxa" w:w="50"/>
+              <w:left w:type="dxa" w:w="90"/>
+              <w:bottom w:type="dxa" w:w="50"/>
+              <w:right w:type="dxa" w:w="90"/>
+            </w:tcMar>
+          </w:tcPr>
+          <w:p>
+            <w:pPr>
+              <w:spacing w:after="0" w:line="260"/>
+            </w:pPr>
+            <w:r>
+              <w:rPr>
+                <w:sz w:val="18"/>
+                <w:szCs w:val="18"/>
+              </w:rPr>
+              <w:t xml:space="preserve">100.000 đến 1 triệu dòng thô; dự kiến lấy khoảng 2.000</w:t>
+            </w:r>
+          </w:p>
+        </w:tc>
+        <w:tc>
+          <w:tcPr>
+            <w:tcW w:type="dxa" w:w="2400"/>
+            <w:shd w:fill="E2EFDA" w:color="auto" w:val="clear"/>
+            <w:tcMar>
+              <w:top w:type="dxa" w:w="50"/>
+              <w:left w:type="dxa" w:w="90"/>
+              <w:bottom w:type="dxa" w:w="50"/>
+              <w:right w:type="dxa" w:w="90"/>
+            </w:tcMar>
+          </w:tcPr>
+          <w:p>
+            <w:pPr>
+              <w:spacing w:after="0" w:line="260"/>
+            </w:pPr>
+            <w:r>
+              <w:rPr>
+                <w:sz w:val="18"/>
+                <w:szCs w:val="18"/>
+              </w:rPr>
+              <w:t xml:space="preserve">Người viết (bài nộp cuộc thi); MIT, phải đồng ý điều khoản để tải</w:t>
+            </w:r>
+          </w:p>
+        </w:tc>
+        <w:tc>
+          <w:tcPr>
+            <w:tcW w:type="dxa" w:w="1726"/>
+            <w:shd w:fill="E2EFDA" w:color="auto" w:val="clear"/>
+            <w:tcMar>
+              <w:top w:type="dxa" w:w="50"/>
+              <w:left w:type="dxa" w:w="90"/>
+              <w:bottom w:type="dxa" w:w="50"/>
+              <w:right w:type="dxa" w:w="90"/>
+            </w:tcMar>
+          </w:tcPr>
+          <w:p>
+            <w:pPr>
+              <w:spacing w:after="0" w:line="260"/>
+            </w:pPr>
+            <w:r>
+              <w:rPr>
+                <w:sz w:val="18"/>
+                <w:szCs w:val="18"/>
+              </w:rPr>
+              <w:t xml:space="preserve">L1 và L2. Đo tỷ lệ bắt tấn công</w:t>
+            </w:r>
+          </w:p>
+        </w:tc>
+      </w:tr>
+      <w:tr>
+        <w:tc>
+          <w:tcPr>
+            <w:tcW w:type="dxa" w:w="2600"/>
+            <w:shd w:fill="E2EFDA" w:color="auto" w:val="clear"/>
+            <w:tcMar>
+              <w:top w:type="dxa" w:w="50"/>
+              <w:left w:type="dxa" w:w="90"/>
+              <w:bottom w:type="dxa" w:w="50"/>
+              <w:right w:type="dxa" w:w="90"/>
+            </w:tcMar>
+          </w:tcPr>
+          <w:p>
+            <w:pPr>
+              <w:spacing w:after="0" w:line="260"/>
+            </w:pPr>
+            <w:r>
+              <w:rPr>
+                <w:sz w:val="18"/>
+                <w:szCs w:val="18"/>
+              </w:rPr>
+              <w:t xml:space="preserve">deepset/prompt-injections (bổ sung)</w:t>
+            </w:r>
+          </w:p>
+        </w:tc>
+        <w:tc>
+          <w:tcPr>
+            <w:tcW w:type="dxa" w:w="2300"/>
+            <w:shd w:fill="E2EFDA" w:color="auto" w:val="clear"/>
+            <w:tcMar>
+              <w:top w:type="dxa" w:w="50"/>
+              <w:left w:type="dxa" w:w="90"/>
+              <w:bottom w:type="dxa" w:w="50"/>
+              <w:right w:type="dxa" w:w="90"/>
+            </w:tcMar>
+          </w:tcPr>
+          <w:p>
+            <w:pPr>
+              <w:spacing w:after="0" w:line="260"/>
+            </w:pPr>
+            <w:r>
+              <w:rPr>
+                <w:sz w:val="18"/>
+                <w:szCs w:val="18"/>
+              </w:rPr>
+              <w:t xml:space="preserve">662, hai nhãn</w:t>
+            </w:r>
+          </w:p>
+        </w:tc>
+        <w:tc>
+          <w:tcPr>
+            <w:tcW w:type="dxa" w:w="2400"/>
+            <w:shd w:fill="E2EFDA" w:color="auto" w:val="clear"/>
+            <w:tcMar>
+              <w:top w:type="dxa" w:w="50"/>
+              <w:left w:type="dxa" w:w="90"/>
+              <w:bottom w:type="dxa" w:w="50"/>
+              <w:right w:type="dxa" w:w="90"/>
+            </w:tcMar>
+          </w:tcPr>
+          <w:p>
+            <w:pPr>
+              <w:spacing w:after="0" w:line="260"/>
+            </w:pPr>
+            <w:r>
+              <w:rPr>
+                <w:sz w:val="18"/>
+                <w:szCs w:val="18"/>
+              </w:rPr>
+              <w:t xml:space="preserve">Công khai, Apache-2.0; lệch độ dài (AUC 0,81), 21% tiếng Đức</w:t>
+            </w:r>
+          </w:p>
+        </w:tc>
+        <w:tc>
+          <w:tcPr>
+            <w:tcW w:type="dxa" w:w="1726"/>
+            <w:shd w:fill="E2EFDA" w:color="auto" w:val="clear"/>
+            <w:tcMar>
+              <w:top w:type="dxa" w:w="50"/>
+              <w:left w:type="dxa" w:w="90"/>
+              <w:bottom w:type="dxa" w:w="50"/>
+              <w:right w:type="dxa" w:w="90"/>
+            </w:tcMar>
+          </w:tcPr>
+          <w:p>
+            <w:pPr>
+              <w:spacing w:after="0" w:line="260"/>
+            </w:pPr>
+            <w:r>
+              <w:rPr>
+                <w:sz w:val="18"/>
+                <w:szCs w:val="18"/>
+              </w:rPr>
+              <w:t xml:space="preserve">L2. Chỉ đo, báo kèm cảnh báo lệch</w:t>
+            </w:r>
+          </w:p>
+        </w:tc>
+      </w:tr>
+      <w:tr>
+        <w:tc>
+          <w:tcPr>
+            <w:tcW w:type="dxa" w:w="2600"/>
+            <w:shd w:fill="E2EFDA" w:color="auto" w:val="clear"/>
+            <w:tcMar>
+              <w:top w:type="dxa" w:w="50"/>
+              <w:left w:type="dxa" w:w="90"/>
+              <w:bottom w:type="dxa" w:w="50"/>
+              <w:right w:type="dxa" w:w="90"/>
+            </w:tcMar>
+          </w:tcPr>
+          <w:p>
+            <w:pPr>
+              <w:spacing w:after="0" w:line="260"/>
+            </w:pPr>
+            <w:r>
+              <w:rPr>
+                <w:sz w:val="18"/>
+                <w:szCs w:val="18"/>
+              </w:rPr>
+              <w:t xml:space="preserve">OWASP LLM01 Benchmark V1 và V2 (bổ sung)</w:t>
+            </w:r>
+          </w:p>
+        </w:tc>
+        <w:tc>
+          <w:tcPr>
+            <w:tcW w:type="dxa" w:w="2300"/>
+            <w:shd w:fill="E2EFDA" w:color="auto" w:val="clear"/>
+            <w:tcMar>
+              <w:top w:type="dxa" w:w="50"/>
+              <w:left w:type="dxa" w:w="90"/>
+              <w:bottom w:type="dxa" w:w="50"/>
+              <w:right w:type="dxa" w:w="90"/>
+            </w:tcMar>
+          </w:tcPr>
+          <w:p>
+            <w:pPr>
+              <w:spacing w:after="0" w:line="260"/>
+            </w:pPr>
+            <w:r>
+              <w:rPr>
+                <w:sz w:val="18"/>
+                <w:szCs w:val="18"/>
+              </w:rPr>
+              <w:t xml:space="preserve">600 mỗi bản (300 chặn / 300 cho qua)</w:t>
+            </w:r>
+          </w:p>
+        </w:tc>
+        <w:tc>
+          <w:tcPr>
+            <w:tcW w:type="dxa" w:w="2400"/>
+            <w:shd w:fill="E2EFDA" w:color="auto" w:val="clear"/>
+            <w:tcMar>
+              <w:top w:type="dxa" w:w="50"/>
+              <w:left w:type="dxa" w:w="90"/>
+              <w:bottom w:type="dxa" w:w="50"/>
+              <w:right w:type="dxa" w:w="90"/>
+            </w:tcMar>
+          </w:tcPr>
+          <w:p>
+            <w:pPr>
+              <w:spacing w:after="0" w:line="260"/>
+            </w:pPr>
+            <w:r>
+              <w:rPr>
+                <w:sz w:val="18"/>
+                <w:szCs w:val="18"/>
+              </w:rPr>
+              <w:t xml:space="preserve">Công khai (PointGuardAI), giấy phép "other"; V1 tự ghi 467 trên 600 dòng là dữ liệu tổng hợp</w:t>
+            </w:r>
+          </w:p>
+        </w:tc>
+        <w:tc>
+          <w:tcPr>
+            <w:tcW w:type="dxa" w:w="1726"/>
+            <w:shd w:fill="E2EFDA" w:color="auto" w:val="clear"/>
+            <w:tcMar>
+              <w:top w:type="dxa" w:w="50"/>
+              <w:left w:type="dxa" w:w="90"/>
+              <w:bottom w:type="dxa" w:w="50"/>
+              <w:right w:type="dxa" w:w="90"/>
+            </w:tcMar>
+          </w:tcPr>
+          <w:p>
+            <w:pPr>
+              <w:spacing w:after="0" w:line="260"/>
+            </w:pPr>
+            <w:r>
+              <w:rPr>
+                <w:sz w:val="18"/>
+                <w:szCs w:val="18"/>
+              </w:rPr>
+              <w:t xml:space="preserve">L2 và L3. Đo cả hai nhãn, gồm chặn nhầm; ca lưng chừng đưa cho L3</w:t>
+            </w:r>
+          </w:p>
+        </w:tc>
+      </w:tr>
+      <w:tr>
+        <w:tc>
+          <w:tcPr>
+            <w:tcW w:type="dxa" w:w="2600"/>
+            <w:shd w:fill="E2EFDA" w:color="auto" w:val="clear"/>
+            <w:tcMar>
+              <w:top w:type="dxa" w:w="50"/>
+              <w:left w:type="dxa" w:w="90"/>
+              <w:bottom w:type="dxa" w:w="50"/>
+              <w:right w:type="dxa" w:w="90"/>
+            </w:tcMar>
+          </w:tcPr>
+          <w:p>
+            <w:pPr>
+              <w:spacing w:after="0" w:line="260"/>
+            </w:pPr>
+            <w:r>
+              <w:rPr>
+                <w:sz w:val="18"/>
+                <w:szCs w:val="18"/>
+              </w:rPr>
+              <w:t xml:space="preserve">Gray Swan IPI (bổ sung)</w:t>
+            </w:r>
+          </w:p>
+        </w:tc>
+        <w:tc>
+          <w:tcPr>
+            <w:tcW w:type="dxa" w:w="2300"/>
+            <w:shd w:fill="E2EFDA" w:color="auto" w:val="clear"/>
+            <w:tcMar>
+              <w:top w:type="dxa" w:w="50"/>
+              <w:left w:type="dxa" w:w="90"/>
+              <w:bottom w:type="dxa" w:w="50"/>
+              <w:right w:type="dxa" w:w="90"/>
+            </w:tcMar>
+          </w:tcPr>
+          <w:p>
+            <w:pPr>
+              <w:spacing w:after="0" w:line="260"/>
+            </w:pPr>
+            <w:r>
+              <w:rPr>
+                <w:sz w:val="18"/>
+                <w:szCs w:val="18"/>
+              </w:rPr>
+              <w:t xml:space="preserve">Chưa biết</w:t>
+            </w:r>
+          </w:p>
+        </w:tc>
+        <w:tc>
+          <w:tcPr>
+            <w:tcW w:type="dxa" w:w="2400"/>
+            <w:shd w:fill="E2EFDA" w:color="auto" w:val="clear"/>
+            <w:tcMar>
+              <w:top w:type="dxa" w:w="50"/>
+              <w:left w:type="dxa" w:w="90"/>
+              <w:bottom w:type="dxa" w:w="50"/>
+              <w:right w:type="dxa" w:w="90"/>
+            </w:tcMar>
+          </w:tcPr>
+          <w:p>
+            <w:pPr>
+              <w:spacing w:after="0" w:line="260"/>
+            </w:pPr>
+            <w:r>
+              <w:rPr>
+                <w:sz w:val="18"/>
+                <w:szCs w:val="18"/>
+              </w:rPr>
+              <w:t xml:space="preserve">Người viết (cuộc thi công khai); giấy phép chưa xác minh</w:t>
+            </w:r>
+          </w:p>
+        </w:tc>
+        <w:tc>
+          <w:tcPr>
+            <w:tcW w:type="dxa" w:w="1726"/>
+            <w:shd w:fill="E2EFDA" w:color="auto" w:val="clear"/>
+            <w:tcMar>
+              <w:top w:type="dxa" w:w="50"/>
+              <w:left w:type="dxa" w:w="90"/>
+              <w:bottom w:type="dxa" w:w="50"/>
+              <w:right w:type="dxa" w:w="90"/>
+            </w:tcMar>
+          </w:tcPr>
+          <w:p>
+            <w:pPr>
+              <w:spacing w:after="0" w:line="260"/>
+            </w:pPr>
+            <w:r>
+              <w:rPr>
+                <w:sz w:val="18"/>
+                <w:szCs w:val="18"/>
+              </w:rPr>
+              <w:t xml:space="preserve">L2 và Spotlighting. Đo tấn công gián tiếp trong tài liệu</w:t>
+            </w:r>
+          </w:p>
+        </w:tc>
+      </w:tr>
+      <w:tr>
+        <w:tc>
+          <w:tcPr>
+            <w:tcW w:type="dxa" w:w="2600"/>
+            <w:shd w:fill="E2EFDA" w:color="auto" w:val="clear"/>
+            <w:tcMar>
+              <w:top w:type="dxa" w:w="50"/>
+              <w:left w:type="dxa" w:w="90"/>
+              <w:bottom w:type="dxa" w:w="50"/>
+              <w:right w:type="dxa" w:w="90"/>
+            </w:tcMar>
+          </w:tcPr>
+          <w:p>
+            <w:pPr>
+              <w:spacing w:after="0" w:line="260"/>
+            </w:pPr>
+            <w:r>
+              <w:rPr>
+                <w:sz w:val="18"/>
+                <w:szCs w:val="18"/>
+              </w:rPr>
+              <w:t xml:space="preserve">InjecAgent (bổ sung)</w:t>
+            </w:r>
+          </w:p>
+        </w:tc>
+        <w:tc>
+          <w:tcPr>
+            <w:tcW w:type="dxa" w:w="2300"/>
+            <w:shd w:fill="E2EFDA" w:color="auto" w:val="clear"/>
+            <w:tcMar>
+              <w:top w:type="dxa" w:w="50"/>
+              <w:left w:type="dxa" w:w="90"/>
+              <w:bottom w:type="dxa" w:w="50"/>
+              <w:right w:type="dxa" w:w="90"/>
+            </w:tcMar>
+          </w:tcPr>
+          <w:p>
+            <w:pPr>
+              <w:spacing w:after="0" w:line="260"/>
+            </w:pPr>
+            <w:r>
+              <w:rPr>
+                <w:sz w:val="18"/>
+                <w:szCs w:val="18"/>
+              </w:rPr>
+              <w:t xml:space="preserve">1.054 ca</w:t>
+            </w:r>
+          </w:p>
+        </w:tc>
+        <w:tc>
+          <w:tcPr>
+            <w:tcW w:type="dxa" w:w="2400"/>
+            <w:shd w:fill="E2EFDA" w:color="auto" w:val="clear"/>
+            <w:tcMar>
+              <w:top w:type="dxa" w:w="50"/>
+              <w:left w:type="dxa" w:w="90"/>
+              <w:bottom w:type="dxa" w:w="50"/>
+              <w:right w:type="dxa" w:w="90"/>
+            </w:tcMar>
+          </w:tcPr>
+          <w:p>
+            <w:pPr>
+              <w:spacing w:after="0" w:line="260"/>
+            </w:pPr>
+            <w:r>
+              <w:rPr>
+                <w:sz w:val="18"/>
+                <w:szCs w:val="18"/>
+              </w:rPr>
+              <w:t xml:space="preserve">Công khai, MIT; ca ghép từ ca người dùng và ca kẻ tấn công</w:t>
+            </w:r>
+          </w:p>
+        </w:tc>
+        <w:tc>
+          <w:tcPr>
+            <w:tcW w:type="dxa" w:w="1726"/>
+            <w:shd w:fill="E2EFDA" w:color="auto" w:val="clear"/>
+            <w:tcMar>
+              <w:top w:type="dxa" w:w="50"/>
+              <w:left w:type="dxa" w:w="90"/>
+              <w:bottom w:type="dxa" w:w="50"/>
+              <w:right w:type="dxa" w:w="90"/>
+            </w:tcMar>
+          </w:tcPr>
+          <w:p>
+            <w:pPr>
+              <w:spacing w:after="0" w:line="260"/>
+            </w:pPr>
+            <w:r>
+              <w:rPr>
+                <w:sz w:val="18"/>
+                <w:szCs w:val="18"/>
+              </w:rPr>
+              <w:t xml:space="preserve">L4 và Spotlighting. Đo lệnh gọi công cụ do kẻ tấn công cài có bị chặn không</w:t>
+            </w:r>
+          </w:p>
+        </w:tc>
+      </w:tr>
+      <w:tr>
+        <w:tc>
+          <w:tcPr>
+            <w:tcW w:type="dxa" w:w="2600"/>
+            <w:shd w:fill="E2EFDA" w:color="auto" w:val="clear"/>
+            <w:tcMar>
+              <w:top w:type="dxa" w:w="50"/>
+              <w:left w:type="dxa" w:w="90"/>
+              <w:bottom w:type="dxa" w:w="50"/>
+              <w:right w:type="dxa" w:w="90"/>
+            </w:tcMar>
+          </w:tcPr>
+          <w:p>
+            <w:pPr>
+              <w:spacing w:after="0" w:line="260"/>
+            </w:pPr>
+            <w:r>
+              <w:rPr>
+                <w:sz w:val="18"/>
+                <w:szCs w:val="18"/>
+              </w:rPr>
+              <w:t xml:space="preserve">MultiJail, bản tiếng Việt (bổ sung)</w:t>
+            </w:r>
+          </w:p>
+        </w:tc>
+        <w:tc>
+          <w:tcPr>
+            <w:tcW w:type="dxa" w:w="2300"/>
+            <w:shd w:fill="E2EFDA" w:color="auto" w:val="clear"/>
+            <w:tcMar>
+              <w:top w:type="dxa" w:w="50"/>
+              <w:left w:type="dxa" w:w="90"/>
+              <w:bottom w:type="dxa" w:w="50"/>
+              <w:right w:type="dxa" w:w="90"/>
+            </w:tcMar>
+          </w:tcPr>
+          <w:p>
+            <w:pPr>
+              <w:spacing w:after="0" w:line="260"/>
+            </w:pPr>
+            <w:r>
+              <w:rPr>
+                <w:sz w:val="18"/>
+                <w:szCs w:val="18"/>
+              </w:rPr>
+              <w:t xml:space="preserve">315 câu</w:t>
+            </w:r>
+          </w:p>
+        </w:tc>
+        <w:tc>
+          <w:tcPr>
+            <w:tcW w:type="dxa" w:w="2400"/>
+            <w:shd w:fill="E2EFDA" w:color="auto" w:val="clear"/>
+            <w:tcMar>
+              <w:top w:type="dxa" w:w="50"/>
+              <w:left w:type="dxa" w:w="90"/>
+              <w:bottom w:type="dxa" w:w="50"/>
+              <w:right w:type="dxa" w:w="90"/>
+            </w:tcMar>
+          </w:tcPr>
+          <w:p>
+            <w:pPr>
+              <w:spacing w:after="0" w:line="260"/>
+            </w:pPr>
+            <w:r>
+              <w:rPr>
+                <w:sz w:val="18"/>
+                <w:szCs w:val="18"/>
+              </w:rPr>
+              <w:t xml:space="preserve">Công khai, MIT; câu hỏi độc hại dịch sang 9 ngôn ngữ, cách dịch chưa xác minh; không phải prompt injection</w:t>
+            </w:r>
+          </w:p>
+        </w:tc>
+        <w:tc>
+          <w:tcPr>
+            <w:tcW w:type="dxa" w:w="1726"/>
+            <w:shd w:fill="E2EFDA" w:color="auto" w:val="clear"/>
+            <w:tcMar>
+              <w:top w:type="dxa" w:w="50"/>
+              <w:left w:type="dxa" w:w="90"/>
+              <w:bottom w:type="dxa" w:w="50"/>
+              <w:right w:type="dxa" w:w="90"/>
+            </w:tcMar>
+          </w:tcPr>
+          <w:p>
+            <w:pPr>
+              <w:spacing w:after="0" w:line="260"/>
+            </w:pPr>
+            <w:r>
+              <w:rPr>
+                <w:sz w:val="18"/>
+                <w:szCs w:val="18"/>
+              </w:rPr>
+              <w:t xml:space="preserve">L2. Đo phụ tiếng Việt, báo riêng</w:t>
+            </w:r>
+          </w:p>
+        </w:tc>
+      </w:tr>
+      <w:tr>
+        <w:tc>
+          <w:tcPr>
+            <w:tcW w:type="dxa" w:w="2600"/>
+            <w:shd w:fill="E2EFDA" w:color="auto" w:val="clear"/>
+            <w:tcMar>
+              <w:top w:type="dxa" w:w="50"/>
+              <w:left w:type="dxa" w:w="90"/>
+              <w:bottom w:type="dxa" w:w="50"/>
+              <w:right w:type="dxa" w:w="90"/>
+            </w:tcMar>
+          </w:tcPr>
+          <w:p>
+            <w:pPr>
+              <w:spacing w:after="0" w:line="260"/>
+            </w:pPr>
+            <w:r>
+              <w:rPr>
+                <w:sz w:val="18"/>
+                <w:szCs w:val="18"/>
+              </w:rPr>
+              <w:t xml:space="preserve">Mẫu tiếng Việt nhóm tự viết (bổ sung)</w:t>
+            </w:r>
+          </w:p>
+        </w:tc>
+        <w:tc>
+          <w:tcPr>
+            <w:tcW w:type="dxa" w:w="2300"/>
+            <w:shd w:fill="E2EFDA" w:color="auto" w:val="clear"/>
+            <w:tcMar>
+              <w:top w:type="dxa" w:w="50"/>
+              <w:left w:type="dxa" w:w="90"/>
+              <w:bottom w:type="dxa" w:w="50"/>
+              <w:right w:type="dxa" w:w="90"/>
+            </w:tcMar>
+          </w:tcPr>
+          <w:p>
+            <w:pPr>
+              <w:spacing w:after="0" w:line="260"/>
+            </w:pPr>
+            <w:r>
+              <w:rPr>
+                <w:sz w:val="18"/>
+                <w:szCs w:val="18"/>
+              </w:rPr>
+              <w:t xml:space="preserve">50 đến 100</w:t>
+            </w:r>
+          </w:p>
+        </w:tc>
+        <w:tc>
+          <w:tcPr>
+            <w:tcW w:type="dxa" w:w="2400"/>
+            <w:shd w:fill="E2EFDA" w:color="auto" w:val="clear"/>
+            <w:tcMar>
+              <w:top w:type="dxa" w:w="50"/>
+              <w:left w:type="dxa" w:w="90"/>
+              <w:bottom w:type="dxa" w:w="50"/>
+              <w:right w:type="dxa" w:w="90"/>
+            </w:tcMar>
+          </w:tcPr>
+          <w:p>
+            <w:pPr>
+              <w:spacing w:after="0" w:line="260"/>
+            </w:pPr>
+            <w:r>
+              <w:rPr>
+                <w:sz w:val="18"/>
+                <w:szCs w:val="18"/>
+              </w:rPr>
+              <w:t xml:space="preserve">Thành viên nhóm, duyệt chéo</w:t>
+            </w:r>
+          </w:p>
+        </w:tc>
+        <w:tc>
+          <w:tcPr>
+            <w:tcW w:type="dxa" w:w="1726"/>
+            <w:shd w:fill="E2EFDA" w:color="auto" w:val="clear"/>
+            <w:tcMar>
+              <w:top w:type="dxa" w:w="50"/>
+              <w:left w:type="dxa" w:w="90"/>
+              <w:bottom w:type="dxa" w:w="50"/>
+              <w:right w:type="dxa" w:w="90"/>
+            </w:tcMar>
+          </w:tcPr>
+          <w:p>
+            <w:pPr>
+              <w:spacing w:after="0" w:line="260"/>
+            </w:pPr>
+            <w:r>
+              <w:rPr>
+                <w:sz w:val="18"/>
+                <w:szCs w:val="18"/>
+              </w:rPr>
+              <w:t xml:space="preserve">L2 và L3. Test tiếng Việt do người viết</w:t>
+            </w:r>
+          </w:p>
+        </w:tc>
+      </w:tr>
     </w:tbl>
     <w:p>
       <w:pPr>
@@ -13075,7 +13859,7 @@
         <w:spacing w:after="60" w:line="290"/>
       </w:pPr>
       <w:r>
-        <w:t xml:space="preserve">L0, L3, L4 và L5 không có dữ liệu huấn luyện: L0 là luật; L3 chỉ có prompt judge_v1.md; L4 là luật Pydantic cộng policies.yaml; L5 là luật. Các bộ đã thử và không dùng cho layer nào: phần dịch của neuralchemy, SEALSBench, rikka-snow, verify_disagreed, chat_vi chưa lọc, docs_vi và các dòng nhãn BIPIA.</w:t>
+        <w:t xml:space="preserve">L0, L3, L4 và L5 không có dữ liệu huấn luyện: L0 là luật; L3 chỉ có prompt judge_v1.md; L4 là luật Pydantic cộng policies.yaml; L5 là luật. Các bộ đã thử hoặc đã xét và không dùng cho layer nào: phần dịch của neuralchemy, SEALSBench, rikka-snow, verify_disagreed, chat_vi chưa lọc, docs_vi, các dòng nhãn BIPIA, vi-alpaca, Viet4All, Tulu3-vi (GPT sinh hoặc dịch máy), các tập gộp Necent và Cogensec (nhãn yếu, khó truy nguồn) và AgentDojo (là framework, cần chạy agent thật).</w:t>
       </w:r>
     </w:p>
     <w:p>
@@ -28130,7 +28914,7 @@
         <w:spacing w:after="60" w:line="290"/>
       </w:pPr>
       <w:r>
-        <w:t xml:space="preserve">Thêm dữ liệu tiếng Việt thật, không do AI sinh, để huấn luyện lại Layer 2 và kiểm chéo vi_test_v1.</w:t>
+        <w:t xml:space="preserve">Đo L1, L2, L3, Spotlighting và L4 trên dữ liệu công khai do người viết theo bảng ở mục 2.5.7 (Tensor Trust, HackAPrompt, OWASP LLM01, Gray Swan, InjecAgent); thêm dữ liệu tiếng Việt do người viết để kiểm chéo vi_test_v1, rồi mới quyết định có huấn luyện lại Layer 2 hay không.</w:t>
       </w:r>
     </w:p>
     <w:p>

</xml_diff>